<commit_message>
docs: add pretty README with logo/badges, update CryptoTrack spec for trips + rules engine
Add a fox-mascot logo banner and tech-stack badges to README.md, and bring
CryptoTrack_Artem_Zakharov.docx's text in line with the shipped product:
multi-currency trip support, the merchant-rules matching layer between
memory and AI categorization, and the corrected fiatAmount DECIMAL precision.
All embedded screenshots/diagrams in the docx are untouched.
</commit_message>
<xml_diff>
--- a/docs/University/CryptoTrack_Artem_Zakharov.docx
+++ b/docs/University/CryptoTrack_Artem_Zakharov.docx
@@ -6,7 +6,7 @@
       <w:pPr>
         <w:pStyle w:val="BodyText"/>
         <w:bidi w:val="0"/>
-        <w:spacing w:before="2268" w:after="283"/>
+        <w:spacing w:lineRule="auto" w:line="300" w:before="2268" w:after="283"/>
         <w:ind w:hanging="0" w:start="0" w:end="0"/>
         <w:jc w:val="center"/>
         <w:rPr/>
@@ -15,7 +15,31 @@
         <w:rPr>
           <w:rStyle w:val="Strong"/>
         </w:rPr>
-        <w:t>CryptoTrack</w:t>
+        <w:t>Meta</w:t>
+      </w:r>
+      <w:r>
+        <w:rPr>
+          <w:rStyle w:val="Strong"/>
+        </w:rPr>
+        <w:t>Spend</w:t>
+      </w:r>
+    </w:p>
+    <w:p>
+      <w:pPr>
+        <w:pStyle w:val="BodyText"/>
+        <w:bidi w:val="0"/>
+        <w:spacing w:lineRule="auto" w:line="300" w:before="2268" w:after="283"/>
+        <w:ind w:hanging="0" w:start="0" w:end="0"/>
+        <w:jc w:val="center"/>
+        <w:rPr/>
+      </w:pPr>
+      <w:r>
+        <w:rPr/>
+        <w:t>System wizualizacji i analizy transakcji MetaMask Car</w:t>
+      </w:r>
+      <w:r>
+        <w:rPr/>
+        <w:t>d</w:t>
       </w:r>
     </w:p>
     <w:p>
@@ -28,7 +52,22 @@
       </w:pPr>
       <w:r>
         <w:rPr/>
-        <w:t>System wizualizacji i analizy transakcji MetaMask Card</w:t>
+        <w:t>Artem Zakharov</w:t>
+      </w:r>
+    </w:p>
+    <w:p>
+      <w:pPr>
+        <w:pStyle w:val="BodyText"/>
+        <w:bidi w:val="0"/>
+        <w:spacing w:before="2268" w:after="283"/>
+        <w:ind w:hanging="0" w:start="0" w:end="1134"/>
+        <w:jc w:val="center"/>
+        <w:rPr/>
+      </w:pPr>
+      <w:r>
+        <w:rPr/>
+        <w:tab/>
+        <w:t>Przedmiot: Systemowe Projektowanie</w:t>
       </w:r>
     </w:p>
     <w:p>
@@ -41,6 +80,7 @@
       </w:pPr>
       <w:r>
         <w:rPr/>
+        <w:t>Grupa: A1</w:t>
       </w:r>
     </w:p>
     <w:p>
@@ -53,45 +93,6 @@
       </w:pPr>
       <w:r>
         <w:rPr/>
-        <w:t>Artem Zakharov</w:t>
-      </w:r>
-    </w:p>
-    <w:p>
-      <w:pPr>
-        <w:pStyle w:val="BodyText"/>
-        <w:bidi w:val="0"/>
-        <w:spacing w:before="2268" w:after="283"/>
-        <w:jc w:val="center"/>
-        <w:rPr/>
-      </w:pPr>
-      <w:r>
-        <w:rPr/>
-        <w:t>Przedmiot: Systemowe Projektowanie</w:t>
-      </w:r>
-    </w:p>
-    <w:p>
-      <w:pPr>
-        <w:pStyle w:val="BodyText"/>
-        <w:bidi w:val="0"/>
-        <w:spacing w:before="2268" w:after="283"/>
-        <w:jc w:val="center"/>
-        <w:rPr/>
-      </w:pPr>
-      <w:r>
-        <w:rPr/>
-        <w:t>Grupa: A1</w:t>
-      </w:r>
-    </w:p>
-    <w:p>
-      <w:pPr>
-        <w:pStyle w:val="BodyText"/>
-        <w:bidi w:val="0"/>
-        <w:spacing w:before="2268" w:after="283"/>
-        <w:jc w:val="center"/>
-        <w:rPr/>
-      </w:pPr>
-      <w:r>
-        <w:rPr/>
         <w:t>Rok akademicki: 2025/2026</w:t>
       </w:r>
     </w:p>
@@ -700,7 +701,7 @@
         <w:rPr>
           <w:rStyle w:val="Strong"/>
         </w:rPr>
-        <w:t>Automatyczna kategoryzacja (AI + pamięć merchantów)</w:t>
+        <w:t>Automatyczna kategoryzacja (pamięć merchantów + reguły + AI)</w:t>
       </w:r>
     </w:p>
     <w:p>
@@ -754,17 +755,27 @@
       </w:pPr>
       <w:r>
         <w:rPr/>
-        <w:t>Usługa OpenAI przypisuje kategorię nieznanym merchantom (</w:t>
+        <w:t>Reguły dopasowania merchantów (</w:t>
       </w:r>
       <w:r>
         <w:rPr>
           <w:rStyle w:val="SourceText"/>
         </w:rPr>
-        <w:t>bulk-categorize</w:t>
-      </w:r>
-      <w:r>
-        <w:rPr/>
-        <w:t xml:space="preserve">). </w:t>
+        <w:t>firstMatchingCategoryId</w:t>
+      </w:r>
+      <w:r>
+        <w:rPr/>
+        <w:t xml:space="preserve">, </w:t>
+      </w:r>
+      <w:r>
+        <w:rPr>
+          <w:rStyle w:val="SourceText"/>
+        </w:rPr>
+        <w:t>packages/shared/src/merchant-rules/match.ts</w:t>
+      </w:r>
+      <w:r>
+        <w:rPr/>
+        <w:t xml:space="preserve">) — proste dopasowanie „nazwa merchanta zawiera X”, pierwsza trafiona reguła wygrywa; uruchamiane po pamięci merchantów i przed AI. </w:t>
       </w:r>
     </w:p>
     <w:p>
@@ -779,58 +790,90 @@
           <w:tab w:val="left" w:pos="1843" w:leader="none"/>
         </w:tabs>
         <w:bidi w:val="0"/>
+        <w:spacing w:before="0" w:after="0"/>
         <w:ind w:hanging="283" w:start="1843" w:end="1134"/>
         <w:jc w:val="start"/>
         <w:rPr/>
       </w:pPr>
       <w:r>
         <w:rPr/>
-        <w:t xml:space="preserve">Śledzenie przebiegu w </w:t>
+        <w:t>Usługa OpenAI przypisuje kategorię nieznanym merchantom (</w:t>
       </w:r>
       <w:r>
         <w:rPr>
           <w:rStyle w:val="SourceText"/>
         </w:rPr>
-        <w:t>CardCategorizationRun</w:t>
-      </w:r>
-      <w:r>
-        <w:rPr/>
-        <w:t xml:space="preserve"> (status, liczniki dopasowań). </w:t>
-      </w:r>
-    </w:p>
-    <w:p>
-      <w:pPr>
-        <w:pStyle w:val="BodyText"/>
-        <w:bidi w:val="0"/>
-        <w:spacing w:before="0" w:after="283"/>
-        <w:jc w:val="start"/>
-        <w:rPr/>
-      </w:pPr>
-      <w:r>
-        <w:rPr>
-          <w:rStyle w:val="Strong"/>
-        </w:rPr>
-        <w:t xml:space="preserve">❖ </w:t>
-      </w:r>
-      <w:r>
-        <w:rPr>
-          <w:rStyle w:val="Strong"/>
-        </w:rPr>
-        <w:t>Analityka i wykresy</w:t>
-      </w:r>
-    </w:p>
-    <w:p>
-      <w:pPr>
-        <w:pStyle w:val="BodyText"/>
-        <w:numPr>
-          <w:ilvl w:val="0"/>
-          <w:numId w:val="7"/>
+        <w:t>bulk-categorize</w:t>
+      </w:r>
+      <w:r>
+        <w:rPr/>
+        <w:t xml:space="preserve">). </w:t>
+      </w:r>
+    </w:p>
+    <w:p>
+      <w:pPr>
+        <w:pStyle w:val="BodyText"/>
+        <w:numPr>
+          <w:ilvl w:val="0"/>
+          <w:numId w:val="6"/>
         </w:numPr>
         <w:tabs>
           <w:tab w:val="clear" w:pos="1134"/>
           <w:tab w:val="left" w:pos="1843" w:leader="none"/>
         </w:tabs>
         <w:bidi w:val="0"/>
+        <w:ind w:hanging="283" w:start="1843" w:end="1134"/>
+        <w:jc w:val="start"/>
+        <w:rPr/>
+      </w:pPr>
+      <w:r>
+        <w:rPr/>
+        <w:t xml:space="preserve">Śledzenie przebiegu w </w:t>
+      </w:r>
+      <w:r>
+        <w:rPr>
+          <w:rStyle w:val="SourceText"/>
+        </w:rPr>
+        <w:t>CardCategorizationRun</w:t>
+      </w:r>
+      <w:r>
+        <w:rPr/>
+        <w:t xml:space="preserve"> (status, liczniki dopasowań). </w:t>
+      </w:r>
+    </w:p>
+    <w:p>
+      <w:pPr>
+        <w:pStyle w:val="BodyText"/>
+        <w:bidi w:val="0"/>
+        <w:spacing w:before="0" w:after="283"/>
+        <w:jc w:val="start"/>
+        <w:rPr/>
+      </w:pPr>
+      <w:r>
+        <w:rPr>
+          <w:rStyle w:val="Strong"/>
+        </w:rPr>
+        <w:t xml:space="preserve">❖ </w:t>
+      </w:r>
+      <w:r>
+        <w:rPr>
+          <w:rStyle w:val="Strong"/>
+        </w:rPr>
+        <w:t>Analityka i wykresy</w:t>
+      </w:r>
+    </w:p>
+    <w:p>
+      <w:pPr>
+        <w:pStyle w:val="BodyText"/>
+        <w:numPr>
+          <w:ilvl w:val="0"/>
+          <w:numId w:val="7"/>
+        </w:numPr>
+        <w:tabs>
+          <w:tab w:val="clear" w:pos="1134"/>
+          <w:tab w:val="left" w:pos="1843" w:leader="none"/>
+        </w:tabs>
+        <w:bidi w:val="0"/>
         <w:spacing w:before="0" w:after="0"/>
         <w:ind w:hanging="283" w:start="1843" w:end="1134"/>
         <w:jc w:val="start"/>
@@ -924,6 +967,140 @@
       <w:r>
         <w:rPr/>
         <w:t xml:space="preserve">Podsumowanie ostatnich transakcji, saldo karty (snapshot z rozszerzenia), szybki wgląd w wydatki. </w:t>
+      </w:r>
+    </w:p>
+    <w:p>
+      <w:pPr>
+        <w:pStyle w:val="BodyText"/>
+        <w:bidi w:val="0"/>
+        <w:spacing w:before="0" w:after="283"/>
+        <w:jc w:val="start"/>
+        <w:rPr/>
+      </w:pPr>
+      <w:r>
+        <w:rPr>
+          <w:rStyle w:val="Strong"/>
+        </w:rPr>
+        <w:t xml:space="preserve">❖ </w:t>
+      </w:r>
+      <w:r>
+        <w:rPr>
+          <w:rStyle w:val="Strong"/>
+        </w:rPr>
+        <w:t>Podróże (Trips) — wielowalutowe zestawienia wydatków</w:t>
+      </w:r>
+    </w:p>
+    <w:p>
+      <w:pPr>
+        <w:pStyle w:val="BodyText"/>
+        <w:numPr>
+          <w:ilvl w:val="0"/>
+          <w:numId w:val="8"/>
+        </w:numPr>
+        <w:tabs>
+          <w:tab w:val="clear" w:pos="1134"/>
+          <w:tab w:val="left" w:pos="1843" w:leader="none"/>
+        </w:tabs>
+        <w:bidi w:val="0"/>
+        <w:ind w:hanging="283" w:start="1843" w:end="1134"/>
+        <w:jc w:val="start"/>
+        <w:rPr/>
+      </w:pPr>
+      <w:r>
+        <w:rPr/>
+        <w:t xml:space="preserve">Grupowanie transakcji w podróże (model </w:t>
+      </w:r>
+      <w:r>
+        <w:rPr>
+          <w:rStyle w:val="SourceText"/>
+        </w:rPr>
+        <w:t>Trip</w:t>
+      </w:r>
+      <w:r>
+        <w:rPr/>
+        <w:t xml:space="preserve"> ↔ </w:t>
+      </w:r>
+      <w:r>
+        <w:rPr>
+          <w:rStyle w:val="SourceText"/>
+        </w:rPr>
+        <w:t>TripTransaction</w:t>
+      </w:r>
+      <w:r>
+        <w:rPr/>
+        <w:t xml:space="preserve">, relacja N:N); nazwa, daty rozpoczęcia/zakończenia i domyślna waluta podróży. </w:t>
+      </w:r>
+    </w:p>
+    <w:p>
+      <w:pPr>
+        <w:pStyle w:val="BodyText"/>
+        <w:numPr>
+          <w:ilvl w:val="0"/>
+          <w:numId w:val="8"/>
+        </w:numPr>
+        <w:tabs>
+          <w:tab w:val="clear" w:pos="1134"/>
+          <w:tab w:val="left" w:pos="1843" w:leader="none"/>
+        </w:tabs>
+        <w:bidi w:val="0"/>
+        <w:ind w:hanging="283" w:start="1843" w:end="1134"/>
+        <w:jc w:val="start"/>
+        <w:rPr/>
+      </w:pPr>
+      <w:r>
+        <w:rPr/>
+        <w:t xml:space="preserve">Waluta podróży wybierana automatycznie przy tworzeniu (najczęstsza, a przy remisie — najwyższa sumą walut transakcji); użytkownik może ją później zmienić z listy (EUR/PLN/USD/GBP/CHF). </w:t>
+      </w:r>
+    </w:p>
+    <w:p>
+      <w:pPr>
+        <w:pStyle w:val="BodyText"/>
+        <w:numPr>
+          <w:ilvl w:val="0"/>
+          <w:numId w:val="8"/>
+        </w:numPr>
+        <w:tabs>
+          <w:tab w:val="clear" w:pos="1134"/>
+          <w:tab w:val="left" w:pos="1843" w:leader="none"/>
+        </w:tabs>
+        <w:bidi w:val="0"/>
+        <w:ind w:hanging="283" w:start="1843" w:end="1134"/>
+        <w:jc w:val="start"/>
+        <w:rPr/>
+      </w:pPr>
+      <w:r>
+        <w:rPr/>
+        <w:t>Widok szczegółów podróży: suma w walucie natywnej każdej transakcji (</w:t>
+      </w:r>
+      <w:r>
+        <w:rPr>
+          <w:rStyle w:val="SourceText"/>
+        </w:rPr>
+        <w:t>totalsByCurrency</w:t>
+      </w:r>
+      <w:r>
+        <w:rPr/>
+        <w:t>) oraz suma i rozkład po kategoriach przeliczone na walutę podróży (</w:t>
+      </w:r>
+      <w:r>
+        <w:rPr>
+          <w:rStyle w:val="SourceText"/>
+        </w:rPr>
+        <w:t>convertedTotal</w:t>
+      </w:r>
+      <w:r>
+        <w:rPr/>
+        <w:t xml:space="preserve">, </w:t>
+      </w:r>
+      <w:r>
+        <w:rPr>
+          <w:rStyle w:val="SourceText"/>
+        </w:rPr>
+        <w:t>categoryBreakdown</w:t>
+      </w:r>
+      <w:r>
+        <w:rPr/>
+        <w:t xml:space="preserve">) wg kursów z frankfurter.app (cache ~24h, z degradacją do kursu 1:1 przy niedostępności API). </w:t>
       </w:r>
     </w:p>
     <w:p>
@@ -1909,7 +2086,12 @@
         </w:rPr>
       </w:pPr>
       <w:r>
-        <w:rPr/>
+        <w:rPr>
+          <w:i/>
+          <w:color w:val="555555"/>
+          <w:bdr w:val="dashed" w:sz="12" w:space="18" w:color="888888"/>
+          <w:shd w:fill="F9F9F9" w:val="clear"/>
+        </w:rPr>
         <w:drawing>
           <wp:anchor distT="0" distB="0" distL="0" distR="0" simplePos="0" relativeHeight="2" behindDoc="0" locked="0" layoutInCell="0" allowOverlap="1">
             <wp:simplePos x="0" y="0"/>
@@ -2016,14 +2198,14 @@
         </w:tblCellMar>
       </w:tblPr>
       <w:tblGrid>
-        <w:gridCol w:w="4327"/>
-        <w:gridCol w:w="5878"/>
+        <w:gridCol w:w="4324"/>
+        <w:gridCol w:w="5881"/>
       </w:tblGrid>
       <w:tr>
         <w:trPr/>
         <w:tc>
           <w:tcPr>
-            <w:tcW w:w="4327" w:type="dxa"/>
+            <w:tcW w:w="4324" w:type="dxa"/>
             <w:tcBorders/>
             <w:vAlign w:val="center"/>
           </w:tcPr>
@@ -2044,7 +2226,7 @@
         </w:tc>
         <w:tc>
           <w:tcPr>
-            <w:tcW w:w="5878" w:type="dxa"/>
+            <w:tcW w:w="5881" w:type="dxa"/>
             <w:tcBorders/>
             <w:vAlign w:val="center"/>
           </w:tcPr>
@@ -2068,7 +2250,7 @@
         <w:trPr/>
         <w:tc>
           <w:tcPr>
-            <w:tcW w:w="4327" w:type="dxa"/>
+            <w:tcW w:w="4324" w:type="dxa"/>
             <w:tcBorders/>
             <w:vAlign w:val="center"/>
           </w:tcPr>
@@ -2088,7 +2270,7 @@
         </w:tc>
         <w:tc>
           <w:tcPr>
-            <w:tcW w:w="5878" w:type="dxa"/>
+            <w:tcW w:w="5881" w:type="dxa"/>
             <w:tcBorders/>
             <w:vAlign w:val="center"/>
           </w:tcPr>
@@ -2111,7 +2293,7 @@
         <w:trPr/>
         <w:tc>
           <w:tcPr>
-            <w:tcW w:w="4327" w:type="dxa"/>
+            <w:tcW w:w="4324" w:type="dxa"/>
             <w:tcBorders/>
             <w:vAlign w:val="center"/>
           </w:tcPr>
@@ -2131,7 +2313,7 @@
         </w:tc>
         <w:tc>
           <w:tcPr>
-            <w:tcW w:w="5878" w:type="dxa"/>
+            <w:tcW w:w="5881" w:type="dxa"/>
             <w:tcBorders/>
             <w:vAlign w:val="center"/>
           </w:tcPr>
@@ -2154,7 +2336,7 @@
         <w:trPr/>
         <w:tc>
           <w:tcPr>
-            <w:tcW w:w="4327" w:type="dxa"/>
+            <w:tcW w:w="4324" w:type="dxa"/>
             <w:tcBorders/>
             <w:vAlign w:val="center"/>
           </w:tcPr>
@@ -2174,7 +2356,7 @@
         </w:tc>
         <w:tc>
           <w:tcPr>
-            <w:tcW w:w="5878" w:type="dxa"/>
+            <w:tcW w:w="5881" w:type="dxa"/>
             <w:tcBorders/>
             <w:vAlign w:val="center"/>
           </w:tcPr>
@@ -2197,7 +2379,7 @@
         <w:trPr/>
         <w:tc>
           <w:tcPr>
-            <w:tcW w:w="4327" w:type="dxa"/>
+            <w:tcW w:w="4324" w:type="dxa"/>
             <w:tcBorders/>
             <w:vAlign w:val="center"/>
           </w:tcPr>
@@ -2217,7 +2399,7 @@
         </w:tc>
         <w:tc>
           <w:tcPr>
-            <w:tcW w:w="5878" w:type="dxa"/>
+            <w:tcW w:w="5881" w:type="dxa"/>
             <w:tcBorders/>
             <w:vAlign w:val="center"/>
           </w:tcPr>
@@ -2240,7 +2422,7 @@
         <w:trPr/>
         <w:tc>
           <w:tcPr>
-            <w:tcW w:w="4327" w:type="dxa"/>
+            <w:tcW w:w="4324" w:type="dxa"/>
             <w:tcBorders/>
             <w:vAlign w:val="center"/>
           </w:tcPr>
@@ -2260,7 +2442,7 @@
         </w:tc>
         <w:tc>
           <w:tcPr>
-            <w:tcW w:w="5878" w:type="dxa"/>
+            <w:tcW w:w="5881" w:type="dxa"/>
             <w:tcBorders/>
             <w:vAlign w:val="center"/>
           </w:tcPr>
@@ -2283,7 +2465,7 @@
         <w:trPr/>
         <w:tc>
           <w:tcPr>
-            <w:tcW w:w="4327" w:type="dxa"/>
+            <w:tcW w:w="4324" w:type="dxa"/>
             <w:tcBorders/>
             <w:vAlign w:val="center"/>
           </w:tcPr>
@@ -2303,7 +2485,7 @@
         </w:tc>
         <w:tc>
           <w:tcPr>
-            <w:tcW w:w="5878" w:type="dxa"/>
+            <w:tcW w:w="5881" w:type="dxa"/>
             <w:tcBorders/>
             <w:vAlign w:val="center"/>
           </w:tcPr>
@@ -2326,7 +2508,7 @@
         <w:trPr/>
         <w:tc>
           <w:tcPr>
-            <w:tcW w:w="4327" w:type="dxa"/>
+            <w:tcW w:w="4324" w:type="dxa"/>
             <w:tcBorders/>
             <w:vAlign w:val="center"/>
           </w:tcPr>
@@ -2346,7 +2528,7 @@
         </w:tc>
         <w:tc>
           <w:tcPr>
-            <w:tcW w:w="5878" w:type="dxa"/>
+            <w:tcW w:w="5881" w:type="dxa"/>
             <w:tcBorders/>
             <w:vAlign w:val="center"/>
           </w:tcPr>
@@ -2855,14 +3037,14 @@
         </w:tblCellMar>
       </w:tblPr>
       <w:tblGrid>
-        <w:gridCol w:w="3980"/>
-        <w:gridCol w:w="6225"/>
+        <w:gridCol w:w="3977"/>
+        <w:gridCol w:w="6228"/>
       </w:tblGrid>
       <w:tr>
         <w:trPr/>
         <w:tc>
           <w:tcPr>
-            <w:tcW w:w="3980" w:type="dxa"/>
+            <w:tcW w:w="3977" w:type="dxa"/>
             <w:tcBorders/>
             <w:vAlign w:val="center"/>
           </w:tcPr>
@@ -2883,7 +3065,7 @@
         </w:tc>
         <w:tc>
           <w:tcPr>
-            <w:tcW w:w="6225" w:type="dxa"/>
+            <w:tcW w:w="6228" w:type="dxa"/>
             <w:tcBorders/>
             <w:vAlign w:val="center"/>
           </w:tcPr>
@@ -2907,7 +3089,7 @@
         <w:trPr/>
         <w:tc>
           <w:tcPr>
-            <w:tcW w:w="3980" w:type="dxa"/>
+            <w:tcW w:w="3977" w:type="dxa"/>
             <w:tcBorders/>
             <w:vAlign w:val="center"/>
           </w:tcPr>
@@ -2927,7 +3109,7 @@
         </w:tc>
         <w:tc>
           <w:tcPr>
-            <w:tcW w:w="6225" w:type="dxa"/>
+            <w:tcW w:w="6228" w:type="dxa"/>
             <w:tcBorders/>
             <w:vAlign w:val="center"/>
           </w:tcPr>
@@ -2950,7 +3132,7 @@
         <w:trPr/>
         <w:tc>
           <w:tcPr>
-            <w:tcW w:w="3980" w:type="dxa"/>
+            <w:tcW w:w="3977" w:type="dxa"/>
             <w:tcBorders/>
             <w:vAlign w:val="center"/>
           </w:tcPr>
@@ -2970,7 +3152,7 @@
         </w:tc>
         <w:tc>
           <w:tcPr>
-            <w:tcW w:w="6225" w:type="dxa"/>
+            <w:tcW w:w="6228" w:type="dxa"/>
             <w:tcBorders/>
             <w:vAlign w:val="center"/>
           </w:tcPr>
@@ -2993,7 +3175,7 @@
         <w:trPr/>
         <w:tc>
           <w:tcPr>
-            <w:tcW w:w="3980" w:type="dxa"/>
+            <w:tcW w:w="3977" w:type="dxa"/>
             <w:tcBorders/>
             <w:vAlign w:val="center"/>
           </w:tcPr>
@@ -3013,7 +3195,7 @@
         </w:tc>
         <w:tc>
           <w:tcPr>
-            <w:tcW w:w="6225" w:type="dxa"/>
+            <w:tcW w:w="6228" w:type="dxa"/>
             <w:tcBorders/>
             <w:vAlign w:val="center"/>
           </w:tcPr>
@@ -3212,7 +3394,39 @@
       </w:pPr>
       <w:r>
         <w:rPr/>
-        <w:t xml:space="preserve">Pozostałe merchanty kierowane do OpenAI; wynik zapisywany i uczy pamięci. </w:t>
+        <w:t>Niedopasowane merchanty przechodzą przez silnik reguł (</w:t>
+      </w:r>
+      <w:r>
+        <w:rPr>
+          <w:rStyle w:val="SourceText"/>
+        </w:rPr>
+        <w:t>firstMatchingCategoryId</w:t>
+      </w:r>
+      <w:r>
+        <w:rPr/>
+        <w:t xml:space="preserve">); dopasowane od razu otrzymują kategorię. </w:t>
+      </w:r>
+    </w:p>
+    <w:p>
+      <w:pPr>
+        <w:pStyle w:val="BodyText"/>
+        <w:numPr>
+          <w:ilvl w:val="0"/>
+          <w:numId w:val="20"/>
+        </w:numPr>
+        <w:tabs>
+          <w:tab w:val="clear" w:pos="1134"/>
+          <w:tab w:val="left" w:pos="1843" w:leader="none"/>
+        </w:tabs>
+        <w:bidi w:val="0"/>
+        <w:spacing w:before="0" w:after="0"/>
+        <w:ind w:hanging="283" w:start="1843" w:end="1134"/>
+        <w:jc w:val="start"/>
+        <w:rPr/>
+      </w:pPr>
+      <w:r>
+        <w:rPr/>
+        <w:t xml:space="preserve">Pozostałe (nieprzypisane przez reguły) merchanty kierowane do OpenAI; wynik zapisywany i uczy pamięci. </w:t>
       </w:r>
     </w:p>
     <w:p>
@@ -3653,7 +3867,12 @@
         </w:rPr>
       </w:pPr>
       <w:r>
-        <w:rPr/>
+        <w:rPr>
+          <w:i/>
+          <w:color w:val="555555"/>
+          <w:bdr w:val="dashed" w:sz="12" w:space="18" w:color="888888"/>
+          <w:shd w:fill="F9F9F9" w:val="clear"/>
+        </w:rPr>
         <w:drawing>
           <wp:anchor distT="0" distB="0" distL="0" distR="0" simplePos="0" relativeHeight="7" behindDoc="0" locked="0" layoutInCell="0" allowOverlap="1">
             <wp:simplePos x="0" y="0"/>
@@ -3729,7 +3948,12 @@
         </w:rPr>
       </w:pPr>
       <w:r>
-        <w:rPr/>
+        <w:rPr>
+          <w:i/>
+          <w:color w:val="555555"/>
+          <w:bdr w:val="dashed" w:sz="12" w:space="18" w:color="888888"/>
+          <w:shd w:fill="F9F9F9" w:val="clear"/>
+        </w:rPr>
         <w:drawing>
           <wp:anchor distT="0" distB="0" distL="0" distR="0" simplePos="0" relativeHeight="8" behindDoc="0" locked="0" layoutInCell="0" allowOverlap="1">
             <wp:simplePos x="0" y="0"/>
@@ -3805,7 +4029,12 @@
         </w:rPr>
       </w:pPr>
       <w:r>
-        <w:rPr/>
+        <w:rPr>
+          <w:i/>
+          <w:color w:val="555555"/>
+          <w:bdr w:val="dashed" w:sz="12" w:space="18" w:color="888888"/>
+          <w:shd w:fill="F9F9F9" w:val="clear"/>
+        </w:rPr>
         <w:drawing>
           <wp:anchor distT="0" distB="0" distL="0" distR="0" simplePos="0" relativeHeight="9" behindDoc="0" locked="0" layoutInCell="0" allowOverlap="1">
             <wp:simplePos x="0" y="0"/>
@@ -3881,7 +4110,12 @@
         </w:rPr>
       </w:pPr>
       <w:r>
-        <w:rPr/>
+        <w:rPr>
+          <w:i/>
+          <w:color w:val="555555"/>
+          <w:bdr w:val="dashed" w:sz="12" w:space="18" w:color="888888"/>
+          <w:shd w:fill="F9F9F9" w:val="clear"/>
+        </w:rPr>
         <w:drawing>
           <wp:anchor distT="0" distB="0" distL="0" distR="0" simplePos="0" relativeHeight="10" behindDoc="0" locked="0" layoutInCell="0" allowOverlap="1">
             <wp:simplePos x="0" y="0"/>
@@ -3958,7 +4192,12 @@
         </w:rPr>
       </w:pPr>
       <w:r>
-        <w:rPr/>
+        <w:rPr>
+          <w:i/>
+          <w:color w:val="555555"/>
+          <w:bdr w:val="dashed" w:sz="12" w:space="18" w:color="888888"/>
+          <w:shd w:fill="F9F9F9" w:val="clear"/>
+        </w:rPr>
         <w:drawing>
           <wp:anchor distT="0" distB="0" distL="0" distR="0" simplePos="0" relativeHeight="11" behindDoc="0" locked="0" layoutInCell="0" allowOverlap="1">
             <wp:simplePos x="0" y="0"/>
@@ -4602,7 +4841,7 @@
       </w:pPr>
       <w:r>
         <w:rPr/>
-        <w:t>Encje: User (1) — (N) Transaction, Category, Session, ExtensionToken, CardMerchantMemory, CardCategorizationRun; User (1) — (1) PortfolioAccount; Category (1) — (N) SubCategory (self-reference parentId).</w:t>
+        <w:t>Encje: User (1) — (N) Transaction, Category, Session, ExtensionToken, CardMerchantMemory, CardCategorizationRun, Trip; User (1) — (1) PortfolioAccount; Category (1) — (N) SubCategory (self-reference parentId); Trip (N) — (N) Transaction przez TripTransaction.</w:t>
       </w:r>
     </w:p>
     <w:p>
@@ -5046,7 +5285,7 @@
         <w:pStyle w:val="PreformattedText"/>
         <w:widowControl w:val="false"/>
         <w:suppressAutoHyphens w:val="true"/>
-        <w:overflowPunct w:val="false"/>
+        <w:overflowPunct w:val="true"/>
         <w:bidi w:val="0"/>
         <w:spacing w:lineRule="auto" w:line="240" w:before="114" w:after="114"/>
         <w:ind w:start="1134" w:end="1134"/>
@@ -5069,7 +5308,7 @@
         <w:pStyle w:val="PreformattedText"/>
         <w:widowControl w:val="false"/>
         <w:suppressAutoHyphens w:val="true"/>
-        <w:overflowPunct w:val="false"/>
+        <w:overflowPunct w:val="true"/>
         <w:bidi w:val="0"/>
         <w:spacing w:lineRule="auto" w:line="240" w:before="114" w:after="114"/>
         <w:ind w:start="1134" w:end="1134"/>
@@ -5091,7 +5330,7 @@
         <w:pStyle w:val="PreformattedText"/>
         <w:widowControl w:val="false"/>
         <w:suppressAutoHyphens w:val="true"/>
-        <w:overflowPunct w:val="false"/>
+        <w:overflowPunct w:val="true"/>
         <w:bidi w:val="0"/>
         <w:spacing w:lineRule="auto" w:line="240" w:before="114" w:after="114"/>
         <w:ind w:start="1134" w:end="1134"/>
@@ -5114,7 +5353,7 @@
         <w:pStyle w:val="PreformattedText"/>
         <w:widowControl w:val="false"/>
         <w:suppressAutoHyphens w:val="true"/>
-        <w:overflowPunct w:val="false"/>
+        <w:overflowPunct w:val="true"/>
         <w:bidi w:val="0"/>
         <w:spacing w:lineRule="auto" w:line="240" w:before="114" w:after="114"/>
         <w:ind w:start="1134" w:end="1134"/>
@@ -5144,7 +5383,7 @@
         <w:pStyle w:val="PreformattedText"/>
         <w:widowControl w:val="false"/>
         <w:suppressAutoHyphens w:val="true"/>
-        <w:overflowPunct w:val="false"/>
+        <w:overflowPunct w:val="true"/>
         <w:bidi w:val="0"/>
         <w:spacing w:lineRule="auto" w:line="240" w:before="114" w:after="114"/>
         <w:ind w:start="1134" w:end="1134"/>
@@ -5174,7 +5413,7 @@
         <w:pStyle w:val="PreformattedText"/>
         <w:widowControl w:val="false"/>
         <w:suppressAutoHyphens w:val="true"/>
-        <w:overflowPunct w:val="false"/>
+        <w:overflowPunct w:val="true"/>
         <w:bidi w:val="0"/>
         <w:spacing w:lineRule="auto" w:line="240" w:before="114" w:after="114"/>
         <w:ind w:start="1134" w:end="1134"/>
@@ -5204,7 +5443,7 @@
         <w:pStyle w:val="PreformattedText"/>
         <w:widowControl w:val="false"/>
         <w:suppressAutoHyphens w:val="true"/>
-        <w:overflowPunct w:val="false"/>
+        <w:overflowPunct w:val="true"/>
         <w:bidi w:val="0"/>
         <w:spacing w:lineRule="auto" w:line="240" w:before="114" w:after="114"/>
         <w:ind w:start="1134" w:end="1134"/>
@@ -5234,7 +5473,7 @@
         <w:pStyle w:val="PreformattedText"/>
         <w:widowControl w:val="false"/>
         <w:suppressAutoHyphens w:val="true"/>
-        <w:overflowPunct w:val="false"/>
+        <w:overflowPunct w:val="true"/>
         <w:bidi w:val="0"/>
         <w:spacing w:lineRule="auto" w:line="240" w:before="114" w:after="114"/>
         <w:ind w:start="1134" w:end="1134"/>
@@ -5264,7 +5503,7 @@
         <w:pStyle w:val="PreformattedText"/>
         <w:widowControl w:val="false"/>
         <w:suppressAutoHyphens w:val="true"/>
-        <w:overflowPunct w:val="false"/>
+        <w:overflowPunct w:val="true"/>
         <w:bidi w:val="0"/>
         <w:spacing w:lineRule="auto" w:line="240" w:before="114" w:after="114"/>
         <w:ind w:start="1134" w:end="1134"/>
@@ -5294,7 +5533,7 @@
         <w:pStyle w:val="PreformattedText"/>
         <w:widowControl w:val="false"/>
         <w:suppressAutoHyphens w:val="true"/>
-        <w:overflowPunct w:val="false"/>
+        <w:overflowPunct w:val="true"/>
         <w:bidi w:val="0"/>
         <w:spacing w:lineRule="auto" w:line="240" w:before="114" w:after="114"/>
         <w:ind w:start="1134" w:end="1134"/>
@@ -5316,7 +5555,7 @@
           <w:color w:val="auto"/>
           <w:lang w:val="en-US" w:eastAsia="zh-CN" w:bidi="hi-IN"/>
         </w:rPr>
-        <w:t>"fiatAmount" DECIMAL(18,2),</w:t>
+        <w:t>"fiatAmount" DECIMAL(24,8),</w:t>
       </w:r>
     </w:p>
     <w:p>
@@ -5324,7 +5563,7 @@
         <w:pStyle w:val="PreformattedText"/>
         <w:widowControl w:val="false"/>
         <w:suppressAutoHyphens w:val="true"/>
-        <w:overflowPunct w:val="false"/>
+        <w:overflowPunct w:val="true"/>
         <w:bidi w:val="0"/>
         <w:spacing w:lineRule="auto" w:line="240" w:before="114" w:after="114"/>
         <w:ind w:start="1134" w:end="1134"/>
@@ -5354,7 +5593,7 @@
         <w:pStyle w:val="PreformattedText"/>
         <w:widowControl w:val="false"/>
         <w:suppressAutoHyphens w:val="true"/>
-        <w:overflowPunct w:val="false"/>
+        <w:overflowPunct w:val="true"/>
         <w:bidi w:val="0"/>
         <w:spacing w:lineRule="auto" w:line="240" w:before="114" w:after="114"/>
         <w:ind w:start="1134" w:end="1134"/>
@@ -5384,7 +5623,7 @@
         <w:pStyle w:val="PreformattedText"/>
         <w:widowControl w:val="false"/>
         <w:suppressAutoHyphens w:val="true"/>
-        <w:overflowPunct w:val="false"/>
+        <w:overflowPunct w:val="true"/>
         <w:bidi w:val="0"/>
         <w:spacing w:lineRule="auto" w:line="240" w:before="114" w:after="114"/>
         <w:ind w:start="1134" w:end="1134"/>
@@ -5414,7 +5653,7 @@
         <w:pStyle w:val="PreformattedText"/>
         <w:widowControl w:val="false"/>
         <w:suppressAutoHyphens w:val="true"/>
-        <w:overflowPunct w:val="false"/>
+        <w:overflowPunct w:val="true"/>
         <w:bidi w:val="0"/>
         <w:spacing w:lineRule="auto" w:line="240" w:before="114" w:after="114"/>
         <w:ind w:start="1134" w:end="1134"/>
@@ -5444,7 +5683,7 @@
         <w:pStyle w:val="PreformattedText"/>
         <w:widowControl w:val="false"/>
         <w:suppressAutoHyphens w:val="true"/>
-        <w:overflowPunct w:val="false"/>
+        <w:overflowPunct w:val="true"/>
         <w:bidi w:val="0"/>
         <w:spacing w:lineRule="auto" w:line="240" w:before="114" w:after="114"/>
         <w:ind w:start="1134" w:end="1134"/>
@@ -5467,7 +5706,7 @@
         <w:pStyle w:val="PreformattedText"/>
         <w:widowControl w:val="false"/>
         <w:suppressAutoHyphens w:val="true"/>
-        <w:overflowPunct w:val="false"/>
+        <w:overflowPunct w:val="true"/>
         <w:bidi w:val="0"/>
         <w:spacing w:lineRule="auto" w:line="240" w:before="114" w:after="114"/>
         <w:ind w:start="1134" w:end="1134"/>
@@ -5490,7 +5729,7 @@
         <w:pStyle w:val="PreformattedText"/>
         <w:widowControl w:val="false"/>
         <w:suppressAutoHyphens w:val="true"/>
-        <w:overflowPunct w:val="false"/>
+        <w:overflowPunct w:val="true"/>
         <w:bidi w:val="0"/>
         <w:spacing w:lineRule="auto" w:line="240" w:before="114" w:after="114"/>
         <w:ind w:start="1134" w:end="1134"/>
@@ -5520,7 +5759,7 @@
         <w:pStyle w:val="PreformattedText"/>
         <w:widowControl w:val="false"/>
         <w:suppressAutoHyphens w:val="true"/>
-        <w:overflowPunct w:val="false"/>
+        <w:overflowPunct w:val="true"/>
         <w:bidi w:val="0"/>
         <w:spacing w:lineRule="auto" w:line="240" w:before="114" w:after="114"/>
         <w:ind w:start="1134" w:end="1134"/>
@@ -5542,7 +5781,7 @@
         <w:pStyle w:val="PreformattedText"/>
         <w:widowControl w:val="false"/>
         <w:suppressAutoHyphens w:val="true"/>
-        <w:overflowPunct w:val="false"/>
+        <w:overflowPunct w:val="true"/>
         <w:bidi w:val="0"/>
         <w:spacing w:lineRule="auto" w:line="240" w:before="114" w:after="114"/>
         <w:ind w:start="1134" w:end="1134"/>
@@ -5616,7 +5855,7 @@
         <w:pStyle w:val="PreformattedText"/>
         <w:widowControl w:val="false"/>
         <w:suppressAutoHyphens w:val="true"/>
-        <w:overflowPunct w:val="false"/>
+        <w:overflowPunct w:val="true"/>
         <w:bidi w:val="0"/>
         <w:spacing w:lineRule="auto" w:line="240" w:before="114" w:after="114"/>
         <w:ind w:start="1134" w:end="1134"/>
@@ -5639,7 +5878,7 @@
         <w:pStyle w:val="PreformattedText"/>
         <w:widowControl w:val="false"/>
         <w:suppressAutoHyphens w:val="true"/>
-        <w:overflowPunct w:val="false"/>
+        <w:overflowPunct w:val="true"/>
         <w:bidi w:val="0"/>
         <w:spacing w:lineRule="auto" w:line="240" w:before="114" w:after="114"/>
         <w:ind w:start="1134" w:end="1134"/>
@@ -5662,7 +5901,7 @@
         <w:pStyle w:val="PreformattedText"/>
         <w:widowControl w:val="false"/>
         <w:suppressAutoHyphens w:val="true"/>
-        <w:overflowPunct w:val="false"/>
+        <w:overflowPunct w:val="true"/>
         <w:bidi w:val="0"/>
         <w:spacing w:lineRule="auto" w:line="240" w:before="114" w:after="114"/>
         <w:ind w:start="1134" w:end="1134"/>
@@ -5692,7 +5931,7 @@
         <w:pStyle w:val="PreformattedText"/>
         <w:widowControl w:val="false"/>
         <w:suppressAutoHyphens w:val="true"/>
-        <w:overflowPunct w:val="false"/>
+        <w:overflowPunct w:val="true"/>
         <w:bidi w:val="0"/>
         <w:spacing w:lineRule="auto" w:line="240" w:before="114" w:after="114"/>
         <w:ind w:start="1134" w:end="1134"/>
@@ -5722,7 +5961,7 @@
         <w:pStyle w:val="PreformattedText"/>
         <w:widowControl w:val="false"/>
         <w:suppressAutoHyphens w:val="true"/>
-        <w:overflowPunct w:val="false"/>
+        <w:overflowPunct w:val="true"/>
         <w:bidi w:val="0"/>
         <w:spacing w:lineRule="auto" w:line="240" w:before="114" w:after="114"/>
         <w:ind w:start="1134" w:end="1134"/>
@@ -5752,7 +5991,7 @@
         <w:pStyle w:val="PreformattedText"/>
         <w:widowControl w:val="false"/>
         <w:suppressAutoHyphens w:val="true"/>
-        <w:overflowPunct w:val="false"/>
+        <w:overflowPunct w:val="true"/>
         <w:bidi w:val="0"/>
         <w:spacing w:lineRule="auto" w:line="240" w:before="114" w:after="114"/>
         <w:ind w:start="1134" w:end="1134"/>
@@ -5782,7 +6021,7 @@
         <w:pStyle w:val="PreformattedText"/>
         <w:widowControl w:val="false"/>
         <w:suppressAutoHyphens w:val="true"/>
-        <w:overflowPunct w:val="false"/>
+        <w:overflowPunct w:val="true"/>
         <w:bidi w:val="0"/>
         <w:spacing w:lineRule="auto" w:line="240" w:before="114" w:after="114"/>
         <w:ind w:start="1134" w:end="1134"/>
@@ -5805,7 +6044,7 @@
         <w:pStyle w:val="PreformattedText"/>
         <w:widowControl w:val="false"/>
         <w:suppressAutoHyphens w:val="true"/>
-        <w:overflowPunct w:val="false"/>
+        <w:overflowPunct w:val="true"/>
         <w:bidi w:val="0"/>
         <w:spacing w:lineRule="auto" w:line="240" w:before="114" w:after="114"/>
         <w:ind w:start="1134" w:end="1134"/>
@@ -5828,7 +6067,7 @@
         <w:pStyle w:val="PreformattedText"/>
         <w:widowControl w:val="false"/>
         <w:suppressAutoHyphens w:val="true"/>
-        <w:overflowPunct w:val="false"/>
+        <w:overflowPunct w:val="true"/>
         <w:bidi w:val="0"/>
         <w:spacing w:lineRule="auto" w:line="240" w:before="114" w:after="114"/>
         <w:ind w:start="1134" w:end="1134"/>
@@ -5851,7 +6090,7 @@
         <w:pStyle w:val="PreformattedText"/>
         <w:widowControl w:val="false"/>
         <w:suppressAutoHyphens w:val="true"/>
-        <w:overflowPunct w:val="false"/>
+        <w:overflowPunct w:val="true"/>
         <w:bidi w:val="0"/>
         <w:spacing w:lineRule="auto" w:line="240" w:before="114" w:after="114"/>
         <w:ind w:start="1134" w:end="1134"/>
@@ -5914,15 +6153,15 @@
         </w:tblCellMar>
       </w:tblPr>
       <w:tblGrid>
-        <w:gridCol w:w="1737"/>
+        <w:gridCol w:w="1734"/>
         <w:gridCol w:w="4322"/>
-        <w:gridCol w:w="4146"/>
+        <w:gridCol w:w="4149"/>
       </w:tblGrid>
       <w:tr>
         <w:trPr/>
         <w:tc>
           <w:tcPr>
-            <w:tcW w:w="1737" w:type="dxa"/>
+            <w:tcW w:w="1734" w:type="dxa"/>
             <w:tcBorders/>
             <w:vAlign w:val="center"/>
           </w:tcPr>
@@ -5932,7 +6171,7 @@
               <w:suppressLineNumbers/>
               <w:bidi w:val="0"/>
               <w:spacing w:before="0" w:after="0"/>
-              <w:ind w:hanging="0" w:start="0"/>
+              <w:ind w:hanging="0" w:start="0" w:end="1134"/>
               <w:jc w:val="start"/>
               <w:rPr/>
             </w:pPr>
@@ -5965,7 +6204,7 @@
         </w:tc>
         <w:tc>
           <w:tcPr>
-            <w:tcW w:w="4146" w:type="dxa"/>
+            <w:tcW w:w="4149" w:type="dxa"/>
             <w:tcBorders/>
             <w:vAlign w:val="center"/>
           </w:tcPr>
@@ -5989,7 +6228,7 @@
         <w:trPr/>
         <w:tc>
           <w:tcPr>
-            <w:tcW w:w="1737" w:type="dxa"/>
+            <w:tcW w:w="1734" w:type="dxa"/>
             <w:tcBorders/>
             <w:vAlign w:val="center"/>
           </w:tcPr>
@@ -6029,7 +6268,7 @@
         </w:tc>
         <w:tc>
           <w:tcPr>
-            <w:tcW w:w="4146" w:type="dxa"/>
+            <w:tcW w:w="4149" w:type="dxa"/>
             <w:tcBorders/>
             <w:vAlign w:val="center"/>
           </w:tcPr>
@@ -6052,7 +6291,7 @@
         <w:trPr/>
         <w:tc>
           <w:tcPr>
-            <w:tcW w:w="1737" w:type="dxa"/>
+            <w:tcW w:w="1734" w:type="dxa"/>
             <w:tcBorders/>
             <w:vAlign w:val="center"/>
           </w:tcPr>
@@ -6092,7 +6331,7 @@
         </w:tc>
         <w:tc>
           <w:tcPr>
-            <w:tcW w:w="4146" w:type="dxa"/>
+            <w:tcW w:w="4149" w:type="dxa"/>
             <w:tcBorders/>
             <w:vAlign w:val="center"/>
           </w:tcPr>
@@ -6115,7 +6354,7 @@
         <w:trPr/>
         <w:tc>
           <w:tcPr>
-            <w:tcW w:w="1737" w:type="dxa"/>
+            <w:tcW w:w="1734" w:type="dxa"/>
             <w:tcBorders/>
             <w:vAlign w:val="center"/>
           </w:tcPr>
@@ -6155,7 +6394,7 @@
         </w:tc>
         <w:tc>
           <w:tcPr>
-            <w:tcW w:w="4146" w:type="dxa"/>
+            <w:tcW w:w="4149" w:type="dxa"/>
             <w:tcBorders/>
             <w:vAlign w:val="center"/>
           </w:tcPr>
@@ -6209,8 +6448,8 @@
       </w:tblPr>
       <w:tblGrid>
         <w:gridCol w:w="1600"/>
-        <w:gridCol w:w="3962"/>
-        <w:gridCol w:w="4643"/>
+        <w:gridCol w:w="3959"/>
+        <w:gridCol w:w="4646"/>
       </w:tblGrid>
       <w:tr>
         <w:trPr/>
@@ -6226,7 +6465,7 @@
               <w:suppressLineNumbers/>
               <w:bidi w:val="0"/>
               <w:spacing w:before="0" w:after="0"/>
-              <w:ind w:hanging="0" w:start="0"/>
+              <w:ind w:hanging="0" w:start="0" w:end="1134"/>
               <w:jc w:val="center"/>
               <w:rPr/>
             </w:pPr>
@@ -6238,7 +6477,7 @@
         </w:tc>
         <w:tc>
           <w:tcPr>
-            <w:tcW w:w="3962" w:type="dxa"/>
+            <w:tcW w:w="3959" w:type="dxa"/>
             <w:tcBorders/>
             <w:vAlign w:val="center"/>
           </w:tcPr>
@@ -6259,7 +6498,7 @@
         </w:tc>
         <w:tc>
           <w:tcPr>
-            <w:tcW w:w="4643" w:type="dxa"/>
+            <w:tcW w:w="4646" w:type="dxa"/>
             <w:tcBorders/>
             <w:vAlign w:val="center"/>
           </w:tcPr>
@@ -6303,7 +6542,7 @@
         </w:tc>
         <w:tc>
           <w:tcPr>
-            <w:tcW w:w="3962" w:type="dxa"/>
+            <w:tcW w:w="3959" w:type="dxa"/>
             <w:tcBorders/>
             <w:vAlign w:val="center"/>
           </w:tcPr>
@@ -6323,7 +6562,7 @@
         </w:tc>
         <w:tc>
           <w:tcPr>
-            <w:tcW w:w="4643" w:type="dxa"/>
+            <w:tcW w:w="4646" w:type="dxa"/>
             <w:tcBorders/>
             <w:vAlign w:val="center"/>
           </w:tcPr>
@@ -6366,7 +6605,7 @@
         </w:tc>
         <w:tc>
           <w:tcPr>
-            <w:tcW w:w="3962" w:type="dxa"/>
+            <w:tcW w:w="3959" w:type="dxa"/>
             <w:tcBorders/>
             <w:vAlign w:val="center"/>
           </w:tcPr>
@@ -6386,7 +6625,7 @@
         </w:tc>
         <w:tc>
           <w:tcPr>
-            <w:tcW w:w="4643" w:type="dxa"/>
+            <w:tcW w:w="4646" w:type="dxa"/>
             <w:tcBorders/>
             <w:vAlign w:val="center"/>
           </w:tcPr>
@@ -6440,8 +6679,8 @@
       </w:tblPr>
       <w:tblGrid>
         <w:gridCol w:w="1534"/>
-        <w:gridCol w:w="3298"/>
-        <w:gridCol w:w="5110"/>
+        <w:gridCol w:w="3295"/>
+        <w:gridCol w:w="5113"/>
       </w:tblGrid>
       <w:tr>
         <w:trPr/>
@@ -6468,7 +6707,7 @@
         </w:tc>
         <w:tc>
           <w:tcPr>
-            <w:tcW w:w="3298" w:type="dxa"/>
+            <w:tcW w:w="3295" w:type="dxa"/>
             <w:tcBorders/>
             <w:vAlign w:val="center"/>
           </w:tcPr>
@@ -6489,7 +6728,7 @@
         </w:tc>
         <w:tc>
           <w:tcPr>
-            <w:tcW w:w="5110" w:type="dxa"/>
+            <w:tcW w:w="5113" w:type="dxa"/>
             <w:tcBorders/>
             <w:vAlign w:val="center"/>
           </w:tcPr>
@@ -6533,7 +6772,7 @@
         </w:tc>
         <w:tc>
           <w:tcPr>
-            <w:tcW w:w="3298" w:type="dxa"/>
+            <w:tcW w:w="3295" w:type="dxa"/>
             <w:tcBorders/>
             <w:vAlign w:val="center"/>
           </w:tcPr>
@@ -6553,7 +6792,7 @@
         </w:tc>
         <w:tc>
           <w:tcPr>
-            <w:tcW w:w="5110" w:type="dxa"/>
+            <w:tcW w:w="5113" w:type="dxa"/>
             <w:tcBorders/>
             <w:vAlign w:val="center"/>
           </w:tcPr>
@@ -6600,7 +6839,12 @@
         </w:rPr>
       </w:pPr>
       <w:r>
-        <w:rPr/>
+        <w:rPr>
+          <w:i/>
+          <w:color w:val="555555"/>
+          <w:bdr w:val="dashed" w:sz="12" w:space="18" w:color="888888"/>
+          <w:shd w:fill="F9F9F9" w:val="clear"/>
+        </w:rPr>
         <w:drawing>
           <wp:anchor distT="0" distB="0" distL="0" distR="0" simplePos="0" relativeHeight="12" behindDoc="0" locked="0" layoutInCell="0" allowOverlap="1">
             <wp:simplePos x="0" y="0"/>
@@ -6737,7 +6981,12 @@
         </w:rPr>
       </w:pPr>
       <w:r>
-        <w:rPr/>
+        <w:rPr>
+          <w:i/>
+          <w:color w:val="555555"/>
+          <w:bdr w:val="dashed" w:sz="12" w:space="18" w:color="888888"/>
+          <w:shd w:fill="F9F9F9" w:val="clear"/>
+        </w:rPr>
         <w:drawing>
           <wp:anchor distT="0" distB="0" distL="0" distR="0" simplePos="0" relativeHeight="13" behindDoc="0" locked="0" layoutInCell="0" allowOverlap="1">
             <wp:simplePos x="0" y="0"/>
@@ -6820,7 +7069,12 @@
         </w:rPr>
       </w:pPr>
       <w:r>
-        <w:rPr/>
+        <w:rPr>
+          <w:i/>
+          <w:color w:val="555555"/>
+          <w:bdr w:val="dashed" w:sz="12" w:space="18" w:color="888888"/>
+          <w:shd w:fill="F9F9F9" w:val="clear"/>
+        </w:rPr>
         <w:drawing>
           <wp:anchor distT="0" distB="0" distL="0" distR="0" simplePos="0" relativeHeight="14" behindDoc="0" locked="0" layoutInCell="0" allowOverlap="1">
             <wp:simplePos x="0" y="0"/>
@@ -6903,7 +7157,12 @@
         </w:rPr>
       </w:pPr>
       <w:r>
-        <w:rPr/>
+        <w:rPr>
+          <w:i/>
+          <w:color w:val="555555"/>
+          <w:bdr w:val="dashed" w:sz="12" w:space="18" w:color="888888"/>
+          <w:shd w:fill="F9F9F9" w:val="clear"/>
+        </w:rPr>
         <w:drawing>
           <wp:anchor distT="0" distB="0" distL="0" distR="0" simplePos="0" relativeHeight="15" behindDoc="0" locked="0" layoutInCell="0" allowOverlap="1">
             <wp:simplePos x="0" y="0"/>
@@ -6967,7 +7226,12 @@
         </w:rPr>
       </w:pPr>
       <w:r>
-        <w:rPr/>
+        <w:rPr>
+          <w:i/>
+          <w:color w:val="555555"/>
+          <w:bdr w:val="dashed" w:sz="12" w:space="18" w:color="888888"/>
+          <w:shd w:fill="F9F9F9" w:val="clear"/>
+        </w:rPr>
         <w:drawing>
           <wp:anchor distT="0" distB="0" distL="0" distR="0" simplePos="0" relativeHeight="16" behindDoc="0" locked="0" layoutInCell="0" allowOverlap="1">
             <wp:simplePos x="0" y="0"/>
@@ -7040,14 +7304,9 @@
         <w:pStyle w:val="BodyText"/>
         <w:bidi w:val="0"/>
         <w:spacing w:before="180" w:after="180"/>
-        <w:ind w:hanging="0" w:start="180" w:end="180"/>
+        <w:ind w:hanging="0" w:start="0" w:end="180"/>
         <w:jc w:val="center"/>
-        <w:rPr>
-          <w:i/>
-          <w:color w:val="555555"/>
-          <w:bdr w:val="dashed" w:sz="12" w:space="18" w:color="888888"/>
-          <w:shd w:fill="F9F9F9" w:val="clear"/>
-        </w:rPr>
+        <w:rPr/>
       </w:pPr>
       <w:r>
         <w:rPr/>
@@ -7101,6 +7360,25 @@
     </w:p>
     <w:p>
       <w:pPr>
+        <w:pStyle w:val="Heading2"/>
+        <w:pageBreakBefore w:val="false"/>
+        <w:numPr>
+          <w:ilvl w:val="0"/>
+          <w:numId w:val="0"/>
+        </w:numPr>
+        <w:bidi w:val="0"/>
+        <w:spacing w:before="200" w:after="120"/>
+        <w:ind w:hanging="0" w:start="1134" w:end="1134"/>
+        <w:jc w:val="start"/>
+        <w:rPr/>
+      </w:pPr>
+      <w:r>
+        <w:rPr/>
+        <w:t>21.5. Lista transakcji</w:t>
+      </w:r>
+    </w:p>
+    <w:p>
+      <w:pPr>
         <w:pStyle w:val="BodyText"/>
         <w:bidi w:val="0"/>
         <w:spacing w:before="180" w:after="180"/>
@@ -7120,46 +7398,6 @@
           <w:bdr w:val="dashed" w:sz="12" w:space="18" w:color="888888"/>
           <w:shd w:fill="F9F9F9" w:val="clear"/>
         </w:rPr>
-        <w:t>[WSTAW SCREENSHOT 2]</w:t>
-        <w:br/>
-        <w:t>Popup rozszerzenia — przycisk „Sync now”, komunikat sukcesu</w:t>
-      </w:r>
-    </w:p>
-    <w:p>
-      <w:pPr>
-        <w:pStyle w:val="Heading2"/>
-        <w:pageBreakBefore w:val="false"/>
-        <w:numPr>
-          <w:ilvl w:val="0"/>
-          <w:numId w:val="0"/>
-        </w:numPr>
-        <w:bidi w:val="0"/>
-        <w:spacing w:before="200" w:after="120"/>
-        <w:ind w:hanging="0" w:start="1134" w:end="1134"/>
-        <w:jc w:val="start"/>
-        <w:rPr/>
-      </w:pPr>
-      <w:r>
-        <w:rPr/>
-        <w:t>21.5. Lista transakcji</w:t>
-      </w:r>
-    </w:p>
-    <w:p>
-      <w:pPr>
-        <w:pStyle w:val="BodyText"/>
-        <w:bidi w:val="0"/>
-        <w:spacing w:before="180" w:after="180"/>
-        <w:ind w:hanging="0" w:start="180" w:end="180"/>
-        <w:jc w:val="center"/>
-        <w:rPr>
-          <w:i/>
-          <w:color w:val="555555"/>
-          <w:bdr w:val="dashed" w:sz="12" w:space="18" w:color="888888"/>
-          <w:shd w:fill="F9F9F9" w:val="clear"/>
-        </w:rPr>
-      </w:pPr>
-      <w:r>
-        <w:rPr/>
         <w:drawing>
           <wp:anchor distT="0" distB="0" distL="0" distR="0" simplePos="0" relativeHeight="18" behindDoc="0" locked="0" layoutInCell="0" allowOverlap="1">
             <wp:simplePos x="0" y="0"/>
@@ -7242,7 +7480,12 @@
         </w:rPr>
       </w:pPr>
       <w:r>
-        <w:rPr/>
+        <w:rPr>
+          <w:i/>
+          <w:color w:val="555555"/>
+          <w:bdr w:val="dashed" w:sz="12" w:space="18" w:color="888888"/>
+          <w:shd w:fill="F9F9F9" w:val="clear"/>
+        </w:rPr>
         <w:drawing>
           <wp:anchor distT="0" distB="0" distL="0" distR="0" simplePos="0" relativeHeight="19" behindDoc="0" locked="0" layoutInCell="0" allowOverlap="1">
             <wp:simplePos x="0" y="0"/>
@@ -7307,7 +7550,7 @@
       </w:pPr>
       <w:r>
         <w:rPr/>
-        <w:t>21.7. Masowa kategoryzacja</w:t>
+        <w:t>21.7. Analityka</w:t>
       </w:r>
     </w:p>
     <w:p>
@@ -7317,74 +7560,20 @@
         <w:spacing w:before="180" w:after="180"/>
         <w:ind w:hanging="0" w:start="180" w:end="180"/>
         <w:jc w:val="center"/>
-        <w:rPr/>
-      </w:pPr>
-      <w:r>
         <w:rPr>
           <w:i/>
           <w:color w:val="555555"/>
           <w:bdr w:val="dashed" w:sz="12" w:space="18" w:color="888888"/>
           <w:shd w:fill="F9F9F9" w:val="clear"/>
         </w:rPr>
-        <w:t>[WSTAW SCREENSHOT]</w:t>
-        <w:br/>
-        <w:t xml:space="preserve">Strona: </w:t>
-      </w:r>
-      <w:r>
-        <w:rPr>
-          <w:rStyle w:val="SourceText"/>
+      </w:pPr>
+      <w:r>
+        <w:rPr>
           <w:i/>
           <w:color w:val="555555"/>
           <w:bdr w:val="dashed" w:sz="12" w:space="18" w:color="888888"/>
           <w:shd w:fill="F9F9F9" w:val="clear"/>
         </w:rPr>
-        <w:t>/categories/categorize</w:t>
-      </w:r>
-      <w:r>
-        <w:rPr>
-          <w:i/>
-          <w:color w:val="555555"/>
-          <w:bdr w:val="dashed" w:sz="12" w:space="18" w:color="888888"/>
-          <w:shd w:fill="F9F9F9" w:val="clear"/>
-        </w:rPr>
-        <w:t xml:space="preserve"> — lista merchantów, przycisk auto-categorize, postęp</w:t>
-      </w:r>
-    </w:p>
-    <w:p>
-      <w:pPr>
-        <w:pStyle w:val="Heading2"/>
-        <w:pageBreakBefore w:val="false"/>
-        <w:numPr>
-          <w:ilvl w:val="0"/>
-          <w:numId w:val="0"/>
-        </w:numPr>
-        <w:bidi w:val="0"/>
-        <w:spacing w:before="200" w:after="120"/>
-        <w:ind w:hanging="0" w:start="1134" w:end="1134"/>
-        <w:jc w:val="start"/>
-        <w:rPr/>
-      </w:pPr>
-      <w:r>
-        <w:rPr/>
-        <w:t>21.8. Analityka</w:t>
-      </w:r>
-    </w:p>
-    <w:p>
-      <w:pPr>
-        <w:pStyle w:val="BodyText"/>
-        <w:bidi w:val="0"/>
-        <w:spacing w:before="180" w:after="180"/>
-        <w:ind w:hanging="0" w:start="180" w:end="180"/>
-        <w:jc w:val="center"/>
-        <w:rPr>
-          <w:i/>
-          <w:color w:val="555555"/>
-          <w:bdr w:val="dashed" w:sz="12" w:space="18" w:color="888888"/>
-          <w:shd w:fill="F9F9F9" w:val="clear"/>
-        </w:rPr>
-      </w:pPr>
-      <w:r>
-        <w:rPr/>
         <w:drawing>
           <wp:anchor distT="0" distB="0" distL="0" distR="0" simplePos="0" relativeHeight="20" behindDoc="0" locked="0" layoutInCell="0" allowOverlap="1">
             <wp:simplePos x="0" y="0"/>
@@ -7431,65 +7620,6 @@
             </a:graphic>
           </wp:anchor>
         </w:drawing>
-      </w:r>
-    </w:p>
-    <w:p>
-      <w:pPr>
-        <w:pStyle w:val="Heading2"/>
-        <w:pageBreakBefore w:val="false"/>
-        <w:numPr>
-          <w:ilvl w:val="0"/>
-          <w:numId w:val="0"/>
-        </w:numPr>
-        <w:bidi w:val="0"/>
-        <w:spacing w:before="200" w:after="120"/>
-        <w:ind w:hanging="0" w:start="1134" w:end="1134"/>
-        <w:jc w:val="start"/>
-        <w:rPr/>
-      </w:pPr>
-      <w:r>
-        <w:rPr/>
-        <w:t>21.9. Edycja transakcji (kategoria)</w:t>
-      </w:r>
-    </w:p>
-    <w:p>
-      <w:pPr>
-        <w:pStyle w:val="BodyText"/>
-        <w:bidi w:val="0"/>
-        <w:spacing w:before="180" w:after="180"/>
-        <w:ind w:hanging="0" w:start="180" w:end="180"/>
-        <w:jc w:val="center"/>
-        <w:rPr/>
-      </w:pPr>
-      <w:r>
-        <w:rPr>
-          <w:i/>
-          <w:color w:val="555555"/>
-          <w:bdr w:val="dashed" w:sz="12" w:space="18" w:color="888888"/>
-          <w:shd w:fill="F9F9F9" w:val="clear"/>
-        </w:rPr>
-        <w:t>[WSTAW SCREENSHOT]</w:t>
-        <w:br/>
-        <w:t xml:space="preserve">Strona: </w:t>
-      </w:r>
-      <w:r>
-        <w:rPr>
-          <w:rStyle w:val="SourceText"/>
-          <w:i/>
-          <w:color w:val="555555"/>
-          <w:bdr w:val="dashed" w:sz="12" w:space="18" w:color="888888"/>
-          <w:shd w:fill="F9F9F9" w:val="clear"/>
-        </w:rPr>
-        <w:t>/transactions</w:t>
-      </w:r>
-      <w:r>
-        <w:rPr>
-          <w:i/>
-          <w:color w:val="555555"/>
-          <w:bdr w:val="dashed" w:sz="12" w:space="18" w:color="888888"/>
-          <w:shd w:fill="F9F9F9" w:val="clear"/>
-        </w:rPr>
-        <w:t xml:space="preserve"> — otwarty dialog/sheet edycji pojedynczej transakcji z wyborem kategorii</w:t>
       </w:r>
     </w:p>
     <w:p>
@@ -11377,7 +11507,7 @@
     <w:pPr>
       <w:widowControl w:val="false"/>
       <w:suppressAutoHyphens w:val="true"/>
-      <w:overflowPunct w:val="false"/>
+      <w:overflowPunct w:val="true"/>
       <w:bidi w:val="0"/>
       <w:spacing w:lineRule="auto" w:line="324" w:before="1134" w:after="1134"/>
       <w:ind w:start="1134" w:end="1134"/>
@@ -11452,6 +11582,13 @@
       <w:szCs w:val="24"/>
     </w:rPr>
   </w:style>
+  <w:style w:type="character" w:styleId="EndnoteCharactersuser">
+    <w:name w:val="Endnote Characters (user)"/>
+    <w:qFormat/>
+    <w:rPr>
+      <w:vertAlign w:val="superscript"/>
+    </w:rPr>
+  </w:style>
   <w:style w:type="character" w:styleId="EndnoteCharacters">
     <w:name w:val="Endnote Characters"/>
     <w:qFormat/>
@@ -11461,6 +11598,13 @@
   </w:style>
   <w:style w:type="character" w:styleId="EndnoteReference">
     <w:name w:val="endnote reference"/>
+    <w:rPr>
+      <w:vertAlign w:val="superscript"/>
+    </w:rPr>
+  </w:style>
+  <w:style w:type="character" w:styleId="FootnoteCharactersuser">
+    <w:name w:val="Footnote Characters (user)"/>
+    <w:qFormat/>
     <w:rPr>
       <w:vertAlign w:val="superscript"/>
     </w:rPr>
@@ -11477,16 +11621,6 @@
     <w:rPr>
       <w:vertAlign w:val="superscript"/>
     </w:rPr>
-  </w:style>
-  <w:style w:type="character" w:styleId="EndnoteCharactersuser">
-    <w:name w:val="Endnote Characters (user)"/>
-    <w:qFormat/>
-    <w:rPr/>
-  </w:style>
-  <w:style w:type="character" w:styleId="FootnoteCharactersuser">
-    <w:name w:val="Footnote Characters (user)"/>
-    <w:qFormat/>
-    <w:rPr/>
   </w:style>
   <w:style w:type="character" w:styleId="Hyperlink">
     <w:name w:val="Hyperlink"/>
@@ -11513,8 +11647,8 @@
       <w:bCs/>
     </w:rPr>
   </w:style>
-  <w:style w:type="character" w:styleId="Bulletsuser">
-    <w:name w:val="Bullets (user)"/>
+  <w:style w:type="character" w:styleId="Bullets">
+    <w:name w:val="Bullets"/>
     <w:qFormat/>
     <w:rPr>
       <w:rFonts w:ascii="OpenSymbol" w:hAnsi="OpenSymbol" w:eastAsia="OpenSymbol" w:cs="OpenSymbol"/>

</xml_diff>

<commit_message>
feat: enhance CI/CD workflow with testing and deployment steps
- Added a new test job in the GitHub Actions workflow to run API tests and generate the Prisma client.
- Configured the workflow to ensure the deployment job depends on the successful completion of the test job.
- Updated the .env.example file by removing unused API key placeholders.
- Added new PDF documents for MetaSpend2 and MetaSpend3 projects.
</commit_message>
<xml_diff>
--- a/docs/University/CryptoTrack_Artem_Zakharov.docx
+++ b/docs/University/CryptoTrack_Artem_Zakharov.docx
@@ -15,13 +15,7 @@
         <w:rPr>
           <w:rStyle w:val="Strong"/>
         </w:rPr>
-        <w:t>Meta</w:t>
-      </w:r>
-      <w:r>
-        <w:rPr>
-          <w:rStyle w:val="Strong"/>
-        </w:rPr>
-        <w:t>Spend</w:t>
+        <w:t>MetaSpend</w:t>
       </w:r>
     </w:p>
     <w:p>
@@ -35,11 +29,7 @@
       </w:pPr>
       <w:r>
         <w:rPr/>
-        <w:t>System wizualizacji i analizy transakcji MetaMask Car</w:t>
-      </w:r>
-      <w:r>
-        <w:rPr/>
-        <w:t>d</w:t>
+        <w:t>System wizualizacji i analizy transakcji MetaMask Card</w:t>
       </w:r>
     </w:p>
     <w:p>
@@ -2198,14 +2188,14 @@
         </w:tblCellMar>
       </w:tblPr>
       <w:tblGrid>
-        <w:gridCol w:w="4324"/>
-        <w:gridCol w:w="5881"/>
+        <w:gridCol w:w="4322"/>
+        <w:gridCol w:w="5883"/>
       </w:tblGrid>
       <w:tr>
         <w:trPr/>
         <w:tc>
           <w:tcPr>
-            <w:tcW w:w="4324" w:type="dxa"/>
+            <w:tcW w:w="4322" w:type="dxa"/>
             <w:tcBorders/>
             <w:vAlign w:val="center"/>
           </w:tcPr>
@@ -2226,7 +2216,7 @@
         </w:tc>
         <w:tc>
           <w:tcPr>
-            <w:tcW w:w="5881" w:type="dxa"/>
+            <w:tcW w:w="5883" w:type="dxa"/>
             <w:tcBorders/>
             <w:vAlign w:val="center"/>
           </w:tcPr>
@@ -2250,7 +2240,7 @@
         <w:trPr/>
         <w:tc>
           <w:tcPr>
-            <w:tcW w:w="4324" w:type="dxa"/>
+            <w:tcW w:w="4322" w:type="dxa"/>
             <w:tcBorders/>
             <w:vAlign w:val="center"/>
           </w:tcPr>
@@ -2270,7 +2260,7 @@
         </w:tc>
         <w:tc>
           <w:tcPr>
-            <w:tcW w:w="5881" w:type="dxa"/>
+            <w:tcW w:w="5883" w:type="dxa"/>
             <w:tcBorders/>
             <w:vAlign w:val="center"/>
           </w:tcPr>
@@ -2293,7 +2283,7 @@
         <w:trPr/>
         <w:tc>
           <w:tcPr>
-            <w:tcW w:w="4324" w:type="dxa"/>
+            <w:tcW w:w="4322" w:type="dxa"/>
             <w:tcBorders/>
             <w:vAlign w:val="center"/>
           </w:tcPr>
@@ -2313,7 +2303,7 @@
         </w:tc>
         <w:tc>
           <w:tcPr>
-            <w:tcW w:w="5881" w:type="dxa"/>
+            <w:tcW w:w="5883" w:type="dxa"/>
             <w:tcBorders/>
             <w:vAlign w:val="center"/>
           </w:tcPr>
@@ -2336,7 +2326,7 @@
         <w:trPr/>
         <w:tc>
           <w:tcPr>
-            <w:tcW w:w="4324" w:type="dxa"/>
+            <w:tcW w:w="4322" w:type="dxa"/>
             <w:tcBorders/>
             <w:vAlign w:val="center"/>
           </w:tcPr>
@@ -2356,7 +2346,7 @@
         </w:tc>
         <w:tc>
           <w:tcPr>
-            <w:tcW w:w="5881" w:type="dxa"/>
+            <w:tcW w:w="5883" w:type="dxa"/>
             <w:tcBorders/>
             <w:vAlign w:val="center"/>
           </w:tcPr>
@@ -2379,7 +2369,7 @@
         <w:trPr/>
         <w:tc>
           <w:tcPr>
-            <w:tcW w:w="4324" w:type="dxa"/>
+            <w:tcW w:w="4322" w:type="dxa"/>
             <w:tcBorders/>
             <w:vAlign w:val="center"/>
           </w:tcPr>
@@ -2399,7 +2389,7 @@
         </w:tc>
         <w:tc>
           <w:tcPr>
-            <w:tcW w:w="5881" w:type="dxa"/>
+            <w:tcW w:w="5883" w:type="dxa"/>
             <w:tcBorders/>
             <w:vAlign w:val="center"/>
           </w:tcPr>
@@ -2422,7 +2412,7 @@
         <w:trPr/>
         <w:tc>
           <w:tcPr>
-            <w:tcW w:w="4324" w:type="dxa"/>
+            <w:tcW w:w="4322" w:type="dxa"/>
             <w:tcBorders/>
             <w:vAlign w:val="center"/>
           </w:tcPr>
@@ -2442,7 +2432,7 @@
         </w:tc>
         <w:tc>
           <w:tcPr>
-            <w:tcW w:w="5881" w:type="dxa"/>
+            <w:tcW w:w="5883" w:type="dxa"/>
             <w:tcBorders/>
             <w:vAlign w:val="center"/>
           </w:tcPr>
@@ -2465,7 +2455,7 @@
         <w:trPr/>
         <w:tc>
           <w:tcPr>
-            <w:tcW w:w="4324" w:type="dxa"/>
+            <w:tcW w:w="4322" w:type="dxa"/>
             <w:tcBorders/>
             <w:vAlign w:val="center"/>
           </w:tcPr>
@@ -2485,7 +2475,7 @@
         </w:tc>
         <w:tc>
           <w:tcPr>
-            <w:tcW w:w="5881" w:type="dxa"/>
+            <w:tcW w:w="5883" w:type="dxa"/>
             <w:tcBorders/>
             <w:vAlign w:val="center"/>
           </w:tcPr>
@@ -2508,7 +2498,7 @@
         <w:trPr/>
         <w:tc>
           <w:tcPr>
-            <w:tcW w:w="4324" w:type="dxa"/>
+            <w:tcW w:w="4322" w:type="dxa"/>
             <w:tcBorders/>
             <w:vAlign w:val="center"/>
           </w:tcPr>
@@ -2528,7 +2518,7 @@
         </w:tc>
         <w:tc>
           <w:tcPr>
-            <w:tcW w:w="5881" w:type="dxa"/>
+            <w:tcW w:w="5883" w:type="dxa"/>
             <w:tcBorders/>
             <w:vAlign w:val="center"/>
           </w:tcPr>
@@ -3037,14 +3027,14 @@
         </w:tblCellMar>
       </w:tblPr>
       <w:tblGrid>
-        <w:gridCol w:w="3977"/>
-        <w:gridCol w:w="6228"/>
+        <w:gridCol w:w="3975"/>
+        <w:gridCol w:w="6230"/>
       </w:tblGrid>
       <w:tr>
         <w:trPr/>
         <w:tc>
           <w:tcPr>
-            <w:tcW w:w="3977" w:type="dxa"/>
+            <w:tcW w:w="3975" w:type="dxa"/>
             <w:tcBorders/>
             <w:vAlign w:val="center"/>
           </w:tcPr>
@@ -3065,7 +3055,7 @@
         </w:tc>
         <w:tc>
           <w:tcPr>
-            <w:tcW w:w="6228" w:type="dxa"/>
+            <w:tcW w:w="6230" w:type="dxa"/>
             <w:tcBorders/>
             <w:vAlign w:val="center"/>
           </w:tcPr>
@@ -3089,7 +3079,7 @@
         <w:trPr/>
         <w:tc>
           <w:tcPr>
-            <w:tcW w:w="3977" w:type="dxa"/>
+            <w:tcW w:w="3975" w:type="dxa"/>
             <w:tcBorders/>
             <w:vAlign w:val="center"/>
           </w:tcPr>
@@ -3109,7 +3099,7 @@
         </w:tc>
         <w:tc>
           <w:tcPr>
-            <w:tcW w:w="6228" w:type="dxa"/>
+            <w:tcW w:w="6230" w:type="dxa"/>
             <w:tcBorders/>
             <w:vAlign w:val="center"/>
           </w:tcPr>
@@ -3132,7 +3122,7 @@
         <w:trPr/>
         <w:tc>
           <w:tcPr>
-            <w:tcW w:w="3977" w:type="dxa"/>
+            <w:tcW w:w="3975" w:type="dxa"/>
             <w:tcBorders/>
             <w:vAlign w:val="center"/>
           </w:tcPr>
@@ -3152,7 +3142,7 @@
         </w:tc>
         <w:tc>
           <w:tcPr>
-            <w:tcW w:w="6228" w:type="dxa"/>
+            <w:tcW w:w="6230" w:type="dxa"/>
             <w:tcBorders/>
             <w:vAlign w:val="center"/>
           </w:tcPr>
@@ -3175,7 +3165,7 @@
         <w:trPr/>
         <w:tc>
           <w:tcPr>
-            <w:tcW w:w="3977" w:type="dxa"/>
+            <w:tcW w:w="3975" w:type="dxa"/>
             <w:tcBorders/>
             <w:vAlign w:val="center"/>
           </w:tcPr>
@@ -3195,7 +3185,7 @@
         </w:tc>
         <w:tc>
           <w:tcPr>
-            <w:tcW w:w="6228" w:type="dxa"/>
+            <w:tcW w:w="6230" w:type="dxa"/>
             <w:tcBorders/>
             <w:vAlign w:val="center"/>
           </w:tcPr>
@@ -4760,39 +4750,6 @@
         <w:pStyle w:val="Heading1"/>
         <w:bidi w:val="0"/>
         <w:jc w:val="center"/>
-        <w:rPr/>
-      </w:pPr>
-      <w:r>
-        <w:rPr/>
-        <w:t>16. Struktura bazy danych</w:t>
-      </w:r>
-    </w:p>
-    <w:p>
-      <w:pPr>
-        <w:pStyle w:val="Heading2"/>
-        <w:pageBreakBefore w:val="false"/>
-        <w:numPr>
-          <w:ilvl w:val="0"/>
-          <w:numId w:val="0"/>
-        </w:numPr>
-        <w:bidi w:val="0"/>
-        <w:spacing w:before="200" w:after="120"/>
-        <w:ind w:hanging="0" w:start="1134" w:end="1134"/>
-        <w:jc w:val="start"/>
-        <w:rPr/>
-      </w:pPr>
-      <w:r>
-        <w:rPr/>
-        <w:t>16.1. Model koncepcyjny</w:t>
-      </w:r>
-    </w:p>
-    <w:p>
-      <w:pPr>
-        <w:pStyle w:val="BodyText"/>
-        <w:bidi w:val="0"/>
-        <w:spacing w:before="180" w:after="180"/>
-        <w:ind w:hanging="0" w:start="180" w:end="180"/>
-        <w:jc w:val="center"/>
         <w:rPr>
           <w:i/>
           <w:color w:val="555555"/>
@@ -4801,15 +4758,8 @@
         </w:rPr>
       </w:pPr>
       <w:r>
-        <w:rPr>
-          <w:i/>
-          <w:color w:val="555555"/>
-          <w:bdr w:val="dashed" w:sz="12" w:space="18" w:color="888888"/>
-          <w:shd w:fill="F9F9F9" w:val="clear"/>
-        </w:rPr>
-        <w:t>[WSTAW SCREENSHOT]</w:t>
-        <w:br/>
-        <w:t>Ten sam co diagram ERD (rozdz. 9) lub uproszczony model koncepcyjny bez typów SQL</w:t>
+        <w:rPr/>
+        <w:t>16. Struktura bazy danych</w:t>
       </w:r>
     </w:p>
     <w:p>
@@ -4949,7 +4899,7 @@
       </w:pPr>
       <w:r>
         <w:rPr/>
-        <w:t>Hasła: bcrypt hash. Tokeny rozszerzenia i refresh: przechowywane jako hash w bazie. Szyfrowanie dysku — zależne od dostawcy hostingu PostgreSQL.</w:t>
+        <w:t xml:space="preserve">Hasła: bcrypt hash. Tokeny rozszerzenia i refresh: przechowywane jako hash w bazie. </w:t>
       </w:r>
     </w:p>
     <w:p>
@@ -6153,15 +6103,15 @@
         </w:tblCellMar>
       </w:tblPr>
       <w:tblGrid>
-        <w:gridCol w:w="1734"/>
+        <w:gridCol w:w="1732"/>
         <w:gridCol w:w="4322"/>
-        <w:gridCol w:w="4149"/>
+        <w:gridCol w:w="4151"/>
       </w:tblGrid>
       <w:tr>
         <w:trPr/>
         <w:tc>
           <w:tcPr>
-            <w:tcW w:w="1734" w:type="dxa"/>
+            <w:tcW w:w="1732" w:type="dxa"/>
             <w:tcBorders/>
             <w:vAlign w:val="center"/>
           </w:tcPr>
@@ -6204,7 +6154,7 @@
         </w:tc>
         <w:tc>
           <w:tcPr>
-            <w:tcW w:w="4149" w:type="dxa"/>
+            <w:tcW w:w="4151" w:type="dxa"/>
             <w:tcBorders/>
             <w:vAlign w:val="center"/>
           </w:tcPr>
@@ -6228,7 +6178,7 @@
         <w:trPr/>
         <w:tc>
           <w:tcPr>
-            <w:tcW w:w="1734" w:type="dxa"/>
+            <w:tcW w:w="1732" w:type="dxa"/>
             <w:tcBorders/>
             <w:vAlign w:val="center"/>
           </w:tcPr>
@@ -6268,7 +6218,7 @@
         </w:tc>
         <w:tc>
           <w:tcPr>
-            <w:tcW w:w="4149" w:type="dxa"/>
+            <w:tcW w:w="4151" w:type="dxa"/>
             <w:tcBorders/>
             <w:vAlign w:val="center"/>
           </w:tcPr>
@@ -6291,7 +6241,7 @@
         <w:trPr/>
         <w:tc>
           <w:tcPr>
-            <w:tcW w:w="1734" w:type="dxa"/>
+            <w:tcW w:w="1732" w:type="dxa"/>
             <w:tcBorders/>
             <w:vAlign w:val="center"/>
           </w:tcPr>
@@ -6331,7 +6281,7 @@
         </w:tc>
         <w:tc>
           <w:tcPr>
-            <w:tcW w:w="4149" w:type="dxa"/>
+            <w:tcW w:w="4151" w:type="dxa"/>
             <w:tcBorders/>
             <w:vAlign w:val="center"/>
           </w:tcPr>
@@ -6354,7 +6304,7 @@
         <w:trPr/>
         <w:tc>
           <w:tcPr>
-            <w:tcW w:w="1734" w:type="dxa"/>
+            <w:tcW w:w="1732" w:type="dxa"/>
             <w:tcBorders/>
             <w:vAlign w:val="center"/>
           </w:tcPr>
@@ -6394,7 +6344,7 @@
         </w:tc>
         <w:tc>
           <w:tcPr>
-            <w:tcW w:w="4149" w:type="dxa"/>
+            <w:tcW w:w="4151" w:type="dxa"/>
             <w:tcBorders/>
             <w:vAlign w:val="center"/>
           </w:tcPr>
@@ -6448,8 +6398,8 @@
       </w:tblPr>
       <w:tblGrid>
         <w:gridCol w:w="1600"/>
-        <w:gridCol w:w="3959"/>
-        <w:gridCol w:w="4646"/>
+        <w:gridCol w:w="3957"/>
+        <w:gridCol w:w="4648"/>
       </w:tblGrid>
       <w:tr>
         <w:trPr/>
@@ -6477,7 +6427,7 @@
         </w:tc>
         <w:tc>
           <w:tcPr>
-            <w:tcW w:w="3959" w:type="dxa"/>
+            <w:tcW w:w="3957" w:type="dxa"/>
             <w:tcBorders/>
             <w:vAlign w:val="center"/>
           </w:tcPr>
@@ -6498,7 +6448,7 @@
         </w:tc>
         <w:tc>
           <w:tcPr>
-            <w:tcW w:w="4646" w:type="dxa"/>
+            <w:tcW w:w="4648" w:type="dxa"/>
             <w:tcBorders/>
             <w:vAlign w:val="center"/>
           </w:tcPr>
@@ -6542,7 +6492,7 @@
         </w:tc>
         <w:tc>
           <w:tcPr>
-            <w:tcW w:w="3959" w:type="dxa"/>
+            <w:tcW w:w="3957" w:type="dxa"/>
             <w:tcBorders/>
             <w:vAlign w:val="center"/>
           </w:tcPr>
@@ -6562,7 +6512,7 @@
         </w:tc>
         <w:tc>
           <w:tcPr>
-            <w:tcW w:w="4646" w:type="dxa"/>
+            <w:tcW w:w="4648" w:type="dxa"/>
             <w:tcBorders/>
             <w:vAlign w:val="center"/>
           </w:tcPr>
@@ -6605,7 +6555,7 @@
         </w:tc>
         <w:tc>
           <w:tcPr>
-            <w:tcW w:w="3959" w:type="dxa"/>
+            <w:tcW w:w="3957" w:type="dxa"/>
             <w:tcBorders/>
             <w:vAlign w:val="center"/>
           </w:tcPr>
@@ -6625,7 +6575,7 @@
         </w:tc>
         <w:tc>
           <w:tcPr>
-            <w:tcW w:w="4646" w:type="dxa"/>
+            <w:tcW w:w="4648" w:type="dxa"/>
             <w:tcBorders/>
             <w:vAlign w:val="center"/>
           </w:tcPr>
@@ -6679,8 +6629,8 @@
       </w:tblPr>
       <w:tblGrid>
         <w:gridCol w:w="1534"/>
-        <w:gridCol w:w="3295"/>
-        <w:gridCol w:w="5113"/>
+        <w:gridCol w:w="3293"/>
+        <w:gridCol w:w="5115"/>
       </w:tblGrid>
       <w:tr>
         <w:trPr/>
@@ -6707,7 +6657,7 @@
         </w:tc>
         <w:tc>
           <w:tcPr>
-            <w:tcW w:w="3295" w:type="dxa"/>
+            <w:tcW w:w="3293" w:type="dxa"/>
             <w:tcBorders/>
             <w:vAlign w:val="center"/>
           </w:tcPr>
@@ -6728,7 +6678,7 @@
         </w:tc>
         <w:tc>
           <w:tcPr>
-            <w:tcW w:w="5113" w:type="dxa"/>
+            <w:tcW w:w="5115" w:type="dxa"/>
             <w:tcBorders/>
             <w:vAlign w:val="center"/>
           </w:tcPr>
@@ -6772,7 +6722,7 @@
         </w:tc>
         <w:tc>
           <w:tcPr>
-            <w:tcW w:w="3295" w:type="dxa"/>
+            <w:tcW w:w="3293" w:type="dxa"/>
             <w:tcBorders/>
             <w:vAlign w:val="center"/>
           </w:tcPr>
@@ -6792,7 +6742,7 @@
         </w:tc>
         <w:tc>
           <w:tcPr>
-            <w:tcW w:w="5113" w:type="dxa"/>
+            <w:tcW w:w="5115" w:type="dxa"/>
             <w:tcBorders/>
             <w:vAlign w:val="center"/>
           </w:tcPr>

</xml_diff>